<commit_message>
feat: rebrand para Predfy / Agente Predfy + page_title atualizado
</commit_message>
<xml_diff>
--- a/docs/RELATORIO_SOLUCAO.docx
+++ b/docs/RELATORIO_SOLUCAO.docx
@@ -78,7 +78,7 @@
           <w:color w:val="003DA5"/>
           <w:sz w:val="36"/>
         </w:rPr>
-        <w:t>Agente Preparador BB + Modelo Analitico</w:t>
+        <w:t>Agente Predfy + Modelo Analitico</w:t>
       </w:r>
     </w:p>
     <w:p>
@@ -189,7 +189,7 @@
           <w:color w:val="1F1F1F"/>
           <w:sz w:val="22"/>
         </w:rPr>
-        <w:t>Agente Preparador + Modelo Analitico</w:t>
+        <w:t>Predfy — Preparador + Modelo Analítico</w:t>
       </w:r>
       <w:r>
         <w:rPr>
@@ -5034,7 +5034,7 @@
           <w:color w:val="5C6670"/>
           <w:sz w:val="18"/>
         </w:rPr>
-        <w:t>Relatorio gerado em 07/05/2026 08:42 · DISEC · Banco do Brasil</w:t>
+        <w:t>Relatorio gerado em 07/05/2026 09:18 · DISEC · Banco do Brasil</w:t>
       </w:r>
     </w:p>
     <w:sectPr>

</xml_diff>